<commit_message>
Change in reusable elements.
</commit_message>
<xml_diff>
--- a/cz/multipage_ide_with_maclan/multipage_with_maclan.docx
+++ b/cz/multipage_ide_with_maclan/multipage_with_maclan.docx
@@ -560,10 +560,10 @@
             <v:path o:extrusionok="f" gradientshapeok="t" o:connecttype="rect"/>
             <o:lock v:ext="edit" aspectratio="t"/>
           </v:shapetype>
-          <v:shape id="_x0000_i1033" type="#_x0000_t75" style="width:293.25pt;height:99pt" o:ole="">
+          <v:shape id="_x0000_i1035" type="#_x0000_t75" style="width:295.2pt;height:100.8pt" o:ole="">
             <v:imagedata r:id="rId8" o:title=""/>
           </v:shape>
-          <o:OLEObject Type="Link" ProgID="Visio.Drawing.15" ShapeID="_x0000_i1033" DrawAspect="Content" r:id="rId9" UpdateMode="Always">
+          <o:OLEObject Type="Link" ProgID="Visio.Drawing.15" ShapeID="_x0000_i1035" DrawAspect="Content" r:id="rId9" UpdateMode="Always">
             <o:LinkType>EnhancedMetaFile</o:LinkType>
             <o:LockedField>false</o:LockedField>
             <o:FieldCodes>\f 0</o:FieldCodes>
@@ -579,27 +579,14 @@
       <w:r>
         <w:t xml:space="preserve">Obrázek </w:t>
       </w:r>
-      <w:r>
-        <w:fldChar w:fldCharType="begin"/>
-      </w:r>
-      <w:r>
-        <w:instrText xml:space="preserve"> SEQ Obrázek \* ARABIC </w:instrText>
-      </w:r>
-      <w:r>
-        <w:fldChar w:fldCharType="separate"/>
-      </w:r>
-      <w:r>
-        <w:rPr>
-          <w:noProof/>
-        </w:rPr>
-        <w:t>1</w:t>
-      </w:r>
-      <w:r>
-        <w:rPr>
-          <w:noProof/>
-        </w:rPr>
-        <w:fldChar w:fldCharType="end"/>
-      </w:r>
+      <w:fldSimple w:instr=" SEQ Obrázek \* ARABIC ">
+        <w:r>
+          <w:rPr>
+            <w:noProof/>
+          </w:rPr>
+          <w:t>1</w:t>
+        </w:r>
+      </w:fldSimple>
       <w:r>
         <w:t>Šablona</w:t>
       </w:r>
@@ -615,10 +602,10 @@
       </w:pPr>
       <w:r>
         <w:object w:dxaOrig="7950" w:dyaOrig="1890" w14:anchorId="080FE977">
-          <v:shape id="_x0000_i1035" type="#_x0000_t75" style="width:397.5pt;height:94.5pt" o:ole="">
+          <v:shape id="_x0000_i1037" type="#_x0000_t75" style="width:396pt;height:93.6pt" o:ole="">
             <v:imagedata r:id="rId10" o:title=""/>
           </v:shape>
-          <o:OLEObject Type="Link" ProgID="Visio.Drawing.15" ShapeID="_x0000_i1035" DrawAspect="Content" r:id="rId11" UpdateMode="Always">
+          <o:OLEObject Type="Link" ProgID="Visio.Drawing.15" ShapeID="_x0000_i1037" DrawAspect="Content" r:id="rId11" UpdateMode="Always">
             <o:LinkType>EnhancedMetaFile</o:LinkType>
             <o:LockedField>false</o:LockedField>
             <o:FieldCodes>\f 0</o:FieldCodes>
@@ -634,27 +621,14 @@
       <w:r>
         <w:t xml:space="preserve">Obrázek </w:t>
       </w:r>
-      <w:r>
-        <w:fldChar w:fldCharType="begin"/>
-      </w:r>
-      <w:r>
-        <w:instrText xml:space="preserve"> SEQ Obrázek \* ARABIC </w:instrText>
-      </w:r>
-      <w:r>
-        <w:fldChar w:fldCharType="separate"/>
-      </w:r>
-      <w:r>
-        <w:rPr>
-          <w:noProof/>
-        </w:rPr>
-        <w:t>2</w:t>
-      </w:r>
-      <w:r>
-        <w:rPr>
-          <w:noProof/>
-        </w:rPr>
-        <w:fldChar w:fldCharType="end"/>
-      </w:r>
+      <w:fldSimple w:instr=" SEQ Obrázek \* ARABIC ">
+        <w:r>
+          <w:rPr>
+            <w:noProof/>
+          </w:rPr>
+          <w:t>2</w:t>
+        </w:r>
+      </w:fldSimple>
       <w:r>
         <w:t>Příklad v</w:t>
       </w:r>
@@ -1149,10 +1123,10 @@
       </w:pPr>
       <w:r>
         <w:object w:dxaOrig="7920" w:dyaOrig="2415" w14:anchorId="4C3158C1">
-          <v:shape id="_x0000_i1037" type="#_x0000_t75" style="width:396pt;height:120.75pt" o:ole="">
+          <v:shape id="_x0000_i1039" type="#_x0000_t75" style="width:396pt;height:122.4pt" o:ole="">
             <v:imagedata r:id="rId12" o:title=""/>
           </v:shape>
-          <o:OLEObject Type="Link" ProgID="Visio.Drawing.15" ShapeID="_x0000_i1037" DrawAspect="Content" r:id="rId13" UpdateMode="Always">
+          <o:OLEObject Type="Link" ProgID="Visio.Drawing.15" ShapeID="_x0000_i1039" DrawAspect="Content" r:id="rId13" UpdateMode="Always">
             <o:LinkType>EnhancedMetaFile</o:LinkType>
             <o:LockedField>false</o:LockedField>
             <o:FieldCodes>\f 0</o:FieldCodes>
@@ -1168,14 +1142,27 @@
       <w:r>
         <w:t xml:space="preserve">Obrázek </w:t>
       </w:r>
-      <w:fldSimple w:instr=" SEQ Obrázek \* ARABIC ">
-        <w:r>
-          <w:rPr>
-            <w:noProof/>
-          </w:rPr>
-          <w:t>3</w:t>
-        </w:r>
-      </w:fldSimple>
+      <w:r>
+        <w:fldChar w:fldCharType="begin"/>
+      </w:r>
+      <w:r>
+        <w:instrText xml:space="preserve"> SEQ Obrázek \* ARABIC </w:instrText>
+      </w:r>
+      <w:r>
+        <w:fldChar w:fldCharType="separate"/>
+      </w:r>
+      <w:r>
+        <w:rPr>
+          <w:noProof/>
+        </w:rPr>
+        <w:t>3</w:t>
+      </w:r>
+      <w:r>
+        <w:rPr>
+          <w:noProof/>
+        </w:rPr>
+        <w:fldChar w:fldCharType="end"/>
+      </w:r>
       <w:r>
         <w:t>Nahrazení soub</w:t>
       </w:r>
@@ -3018,10 +3005,10 @@
           <w:iCs/>
         </w:rPr>
         <w:object w:dxaOrig="4245" w:dyaOrig="3360" w14:anchorId="4DE19D45">
-          <v:shape id="_x0000_i1039" type="#_x0000_t75" style="width:212.25pt;height:168pt" o:ole="">
+          <v:shape id="_x0000_i1041" type="#_x0000_t75" style="width:208.8pt;height:165.6pt" o:ole="">
             <v:imagedata r:id="rId14" o:title=""/>
           </v:shape>
-          <o:OLEObject Type="Link" ProgID="Visio.Drawing.15" ShapeID="_x0000_i1039" DrawAspect="Content" r:id="rId15" UpdateMode="Always">
+          <o:OLEObject Type="Link" ProgID="Visio.Drawing.15" ShapeID="_x0000_i1041" DrawAspect="Content" r:id="rId15" UpdateMode="Always">
             <o:LinkType>EnhancedMetaFile</o:LinkType>
             <o:LockedField>false</o:LockedField>
             <o:FieldCodes>\f 0</o:FieldCodes>
@@ -3037,14 +3024,27 @@
       <w:r>
         <w:t xml:space="preserve">Obrázek </w:t>
       </w:r>
-      <w:fldSimple w:instr=" SEQ Obrázek \* ARABIC ">
-        <w:r>
-          <w:rPr>
-            <w:noProof/>
-          </w:rPr>
-          <w:t>4</w:t>
-        </w:r>
-      </w:fldSimple>
+      <w:r>
+        <w:fldChar w:fldCharType="begin"/>
+      </w:r>
+      <w:r>
+        <w:instrText xml:space="preserve"> SEQ Obrázek \* ARABIC </w:instrText>
+      </w:r>
+      <w:r>
+        <w:fldChar w:fldCharType="separate"/>
+      </w:r>
+      <w:r>
+        <w:rPr>
+          <w:noProof/>
+        </w:rPr>
+        <w:t>4</w:t>
+      </w:r>
+      <w:r>
+        <w:rPr>
+          <w:noProof/>
+        </w:rPr>
+        <w:fldChar w:fldCharType="end"/>
+      </w:r>
       <w:r>
         <w:t>Příklad oblasti s podoblastmi a sloty</w:t>
       </w:r>
@@ -6412,14 +6412,27 @@
       <w:r>
         <w:t xml:space="preserve">Obrázek </w:t>
       </w:r>
-      <w:fldSimple w:instr=" SEQ Obrázek \* ARABIC ">
-        <w:r>
-          <w:rPr>
-            <w:noProof/>
-          </w:rPr>
-          <w:t>6</w:t>
-        </w:r>
-      </w:fldSimple>
+      <w:r>
+        <w:fldChar w:fldCharType="begin"/>
+      </w:r>
+      <w:r>
+        <w:instrText xml:space="preserve"> SEQ Obrázek \* ARABIC </w:instrText>
+      </w:r>
+      <w:r>
+        <w:fldChar w:fldCharType="separate"/>
+      </w:r>
+      <w:r>
+        <w:rPr>
+          <w:noProof/>
+        </w:rPr>
+        <w:t>6</w:t>
+      </w:r>
+      <w:r>
+        <w:rPr>
+          <w:noProof/>
+        </w:rPr>
+        <w:fldChar w:fldCharType="end"/>
+      </w:r>
       <w:r>
         <w:t>Komponenty GUI pro zobrazení všech oblastí a souvisejících slotů</w:t>
       </w:r>
@@ -6974,10 +6987,10 @@
       </w:pPr>
       <w:r>
         <w:object w:dxaOrig="6825" w:dyaOrig="3630" w14:anchorId="1211BD90">
-          <v:shape id="_x0000_i1043" type="#_x0000_t75" style="width:341.25pt;height:181.5pt" o:ole="">
+          <v:shape id="_x0000_i1045" type="#_x0000_t75" style="width:341.25pt;height:181.5pt" o:ole="">
             <v:imagedata r:id="rId18" o:title=""/>
           </v:shape>
-          <o:OLEObject Type="Link" ProgID="Visio.Drawing.15" ShapeID="_x0000_i1043" DrawAspect="Content" r:id="rId19" UpdateMode="Always">
+          <o:OLEObject Type="Link" ProgID="Visio.Drawing.15" ShapeID="_x0000_i1045" DrawAspect="Content" r:id="rId19" UpdateMode="Always">
             <o:LinkType>EnhancedMetaFile</o:LinkType>
             <o:LockedField>false</o:LockedField>
             <o:FieldCodes>\f 0</o:FieldCodes>
@@ -6996,14 +7009,27 @@
       <w:r>
         <w:t xml:space="preserve">Obrázek </w:t>
       </w:r>
-      <w:fldSimple w:instr=" SEQ Obrázek \* ARABIC ">
-        <w:r>
-          <w:rPr>
-            <w:noProof/>
-          </w:rPr>
-          <w:t>7</w:t>
-        </w:r>
-      </w:fldSimple>
+      <w:r>
+        <w:fldChar w:fldCharType="begin"/>
+      </w:r>
+      <w:r>
+        <w:instrText xml:space="preserve"> SEQ Obrázek \* ARABIC </w:instrText>
+      </w:r>
+      <w:r>
+        <w:fldChar w:fldCharType="separate"/>
+      </w:r>
+      <w:r>
+        <w:rPr>
+          <w:noProof/>
+        </w:rPr>
+        <w:t>7</w:t>
+      </w:r>
+      <w:r>
+        <w:rPr>
+          <w:noProof/>
+        </w:rPr>
+        <w:fldChar w:fldCharType="end"/>
+      </w:r>
       <w:r>
         <w:t xml:space="preserve"> Graf s </w:t>
       </w:r>
@@ -7517,11 +7543,11 @@
         <w:jc w:val="center"/>
       </w:pPr>
       <w:r>
-        <w:object w:dxaOrig="3856" w:dyaOrig="4351" w14:anchorId="1578E03E">
-          <v:shape id="_x0000_i1050" type="#_x0000_t75" style="width:192.75pt;height:217.5pt" o:ole="">
+        <w:object w:dxaOrig="3855" w:dyaOrig="4350" w14:anchorId="1578E03E">
+          <v:shape id="_x0000_i1047" type="#_x0000_t75" style="width:192.75pt;height:217.5pt" o:ole="">
             <v:imagedata r:id="rId20" o:title=""/>
           </v:shape>
-          <o:OLEObject Type="Link" ProgID="Visio.Drawing.15" ShapeID="_x0000_i1050" DrawAspect="Content" r:id="rId21" UpdateMode="Always">
+          <o:OLEObject Type="Link" ProgID="Visio.Drawing.15" ShapeID="_x0000_i1047" DrawAspect="Content" r:id="rId21" UpdateMode="Always">
             <o:LinkType>EnhancedMetaFile</o:LinkType>
             <o:LockedField>false</o:LockedField>
             <o:FieldCodes>\f 0</o:FieldCodes>
@@ -7537,14 +7563,27 @@
       <w:r>
         <w:t xml:space="preserve">Obrázek </w:t>
       </w:r>
-      <w:fldSimple w:instr=" SEQ Obrázek \* ARABIC ">
-        <w:r>
-          <w:rPr>
-            <w:noProof/>
-          </w:rPr>
-          <w:t>8</w:t>
-        </w:r>
-      </w:fldSimple>
+      <w:r>
+        <w:fldChar w:fldCharType="begin"/>
+      </w:r>
+      <w:r>
+        <w:instrText xml:space="preserve"> SEQ Obrázek \* ARABIC </w:instrText>
+      </w:r>
+      <w:r>
+        <w:fldChar w:fldCharType="separate"/>
+      </w:r>
+      <w:r>
+        <w:rPr>
+          <w:noProof/>
+        </w:rPr>
+        <w:t>8</w:t>
+      </w:r>
+      <w:r>
+        <w:rPr>
+          <w:noProof/>
+        </w:rPr>
+        <w:fldChar w:fldCharType="end"/>
+      </w:r>
       <w:r>
         <w:t xml:space="preserve"> </w:t>
       </w:r>
@@ -7559,16 +7598,13 @@
         </w:rPr>
       </w:pPr>
       <w:r>
-        <w:t>Skutečnost, že lze ve směru některé hrany informaci dědit, může odpovídající hrana povolit nebo zakázat. Podobně mohou také sloty v oblastech, které jsou v relaci s aktuální oblastí, povolovat nebo zakazovat preprocesoru jejich nalezení. Z toho plyn</w:t>
-      </w:r>
-      <w:r>
-        <w:t>e</w:t>
-      </w:r>
-      <w:r>
-        <w:t>, že ne všechny hrany (relace) umožňují dědění vlastností.</w:t>
-      </w:r>
-      <w:r>
-        <w:t xml:space="preserve"> Následující obrázek ukazuje </w:t>
+        <w:t xml:space="preserve">Skutečnost, že lze ve směru některé hrany informaci dědit, může odpovídající hrana povolit nebo zakázat. Podobně mohou také sloty v oblastech, které jsou v relaci s aktuální oblastí, povolovat nebo zakazovat preprocesoru </w:t>
+      </w:r>
+      <w:r>
+        <w:t xml:space="preserve">své </w:t>
+      </w:r>
+      <w:r>
+        <w:t xml:space="preserve">nalezení. Z toho plyne, že ne všechny hrany (relace) umožňují dědění vlastností. Následující obrázek ukazuje </w:t>
       </w:r>
       <w:r>
         <w:t xml:space="preserve">zákaz dědění z makro oblasti </w:t>
@@ -7648,11 +7684,11 @@
         <w:jc w:val="center"/>
       </w:pPr>
       <w:r>
-        <w:object w:dxaOrig="2881" w:dyaOrig="4486" w14:anchorId="4B76EB91">
-          <v:shape id="_x0000_i1052" type="#_x0000_t75" style="width:2in;height:224.25pt" o:ole="">
+        <w:object w:dxaOrig="2880" w:dyaOrig="4485" w14:anchorId="4B76EB91">
+          <v:shape id="_x0000_i1049" type="#_x0000_t75" style="width:2in;height:224.25pt" o:ole="">
             <v:imagedata r:id="rId22" o:title=""/>
           </v:shape>
-          <o:OLEObject Type="Link" ProgID="Visio.Drawing.15" ShapeID="_x0000_i1052" DrawAspect="Content" r:id="rId23" UpdateMode="Always">
+          <o:OLEObject Type="Link" ProgID="Visio.Drawing.15" ShapeID="_x0000_i1049" DrawAspect="Content" r:id="rId23" UpdateMode="Always">
             <o:LinkType>EnhancedMetaFile</o:LinkType>
             <o:LockedField>false</o:LockedField>
             <o:FieldCodes>\f 0</o:FieldCodes>
@@ -7671,14 +7707,27 @@
       <w:r>
         <w:t xml:space="preserve">Obrázek </w:t>
       </w:r>
-      <w:fldSimple w:instr=" SEQ Obrázek \* ARABIC ">
-        <w:r>
-          <w:rPr>
-            <w:noProof/>
-          </w:rPr>
-          <w:t>9</w:t>
-        </w:r>
-      </w:fldSimple>
+      <w:r>
+        <w:fldChar w:fldCharType="begin"/>
+      </w:r>
+      <w:r>
+        <w:instrText xml:space="preserve"> SEQ Obrázek \* ARABIC </w:instrText>
+      </w:r>
+      <w:r>
+        <w:fldChar w:fldCharType="separate"/>
+      </w:r>
+      <w:r>
+        <w:rPr>
+          <w:noProof/>
+        </w:rPr>
+        <w:t>9</w:t>
+      </w:r>
+      <w:r>
+        <w:rPr>
+          <w:noProof/>
+        </w:rPr>
+        <w:fldChar w:fldCharType="end"/>
+      </w:r>
       <w:r>
         <w:t xml:space="preserve"> Omezení dědičnosti z oblasti A</w:t>
       </w:r>
@@ -7691,6 +7740,139 @@
     </w:p>
     <w:p>
       <w:r>
+        <w:t xml:space="preserve">V předchozím grafu má tedy oblast </w:t>
+      </w:r>
+      <m:oMath>
+        <m:sSub>
+          <m:sSubPr>
+            <m:ctrlPr>
+              <w:rPr>
+                <w:rFonts w:ascii="Cambria Math" w:hAnsi="Cambria Math"/>
+                <w:i/>
+              </w:rPr>
+            </m:ctrlPr>
+          </m:sSubPr>
+          <m:e>
+            <m:r>
+              <w:rPr>
+                <w:rFonts w:ascii="Cambria Math" w:hAnsi="Cambria Math"/>
+              </w:rPr>
+              <m:t>A</m:t>
+            </m:r>
+          </m:e>
+          <m:sub>
+            <m:r>
+              <w:rPr>
+                <w:rFonts w:ascii="Cambria Math" w:hAnsi="Cambria Math"/>
+              </w:rPr>
+              <m:t>21</m:t>
+            </m:r>
+          </m:sub>
+        </m:sSub>
+      </m:oMath>
+      <w:r>
+        <w:rPr>
+          <w:rFonts w:eastAsiaTheme="minorEastAsia"/>
+        </w:rPr>
+        <w:t xml:space="preserve"> zakázáno dědit z oblasti </w:t>
+      </w:r>
+      <m:oMath>
+        <m:sSub>
+          <m:sSubPr>
+            <m:ctrlPr>
+              <w:rPr>
+                <w:rFonts w:ascii="Cambria Math" w:eastAsiaTheme="minorEastAsia" w:hAnsi="Cambria Math"/>
+                <w:i/>
+              </w:rPr>
+            </m:ctrlPr>
+          </m:sSubPr>
+          <m:e>
+            <m:r>
+              <w:rPr>
+                <w:rFonts w:ascii="Cambria Math" w:eastAsiaTheme="minorEastAsia" w:hAnsi="Cambria Math"/>
+              </w:rPr>
+              <m:t>A</m:t>
+            </m:r>
+          </m:e>
+          <m:sub>
+            <m:r>
+              <w:rPr>
+                <w:rFonts w:ascii="Cambria Math" w:eastAsiaTheme="minorEastAsia" w:hAnsi="Cambria Math"/>
+              </w:rPr>
+              <m:t>2</m:t>
+            </m:r>
+          </m:sub>
+        </m:sSub>
+      </m:oMath>
+      <w:r>
+        <w:rPr>
+          <w:rFonts w:eastAsiaTheme="minorEastAsia"/>
+        </w:rPr>
+        <w:t xml:space="preserve"> a k ní navazujících makro oblastí. Poslední obrázek je sice složitý, ale </w:t>
+      </w:r>
+      <w:r>
+        <w:rPr>
+          <w:rFonts w:eastAsiaTheme="minorEastAsia"/>
+        </w:rPr>
+        <w:t>také</w:t>
+      </w:r>
+      <w:r>
+        <w:rPr>
+          <w:rFonts w:eastAsiaTheme="minorEastAsia"/>
+        </w:rPr>
+        <w:t xml:space="preserve"> vyčerpávajícím způsobem </w:t>
+      </w:r>
+      <w:r>
+        <w:rPr>
+          <w:rFonts w:eastAsiaTheme="minorEastAsia"/>
+        </w:rPr>
+        <w:t>prezentuje</w:t>
+      </w:r>
+      <w:r>
+        <w:rPr>
+          <w:rFonts w:eastAsiaTheme="minorEastAsia"/>
+        </w:rPr>
+        <w:t xml:space="preserve"> </w:t>
+      </w:r>
+      <w:r>
+        <w:rPr>
+          <w:rFonts w:eastAsiaTheme="minorEastAsia"/>
+        </w:rPr>
+        <w:t xml:space="preserve">to </w:t>
+      </w:r>
+      <w:r>
+        <w:rPr>
+          <w:rFonts w:eastAsiaTheme="minorEastAsia"/>
+        </w:rPr>
+        <w:t>co lze říci o dědění informací v</w:t>
+      </w:r>
+      <w:r>
+        <w:rPr>
+          <w:rFonts w:eastAsiaTheme="minorEastAsia"/>
+        </w:rPr>
+        <w:t> </w:t>
+      </w:r>
+      <w:r>
+        <w:rPr>
+          <w:rFonts w:eastAsiaTheme="minorEastAsia"/>
+        </w:rPr>
+        <w:t>oblast</w:t>
+      </w:r>
+      <w:r>
+        <w:rPr>
+          <w:rFonts w:eastAsiaTheme="minorEastAsia"/>
+        </w:rPr>
+        <w:t>ech.</w:t>
+      </w:r>
+      <w:r>
+        <w:rPr>
+          <w:rFonts w:eastAsiaTheme="minorEastAsia"/>
+        </w:rPr>
+        <w:t xml:space="preserve"> </w:t>
+      </w:r>
+    </w:p>
+    <w:p>
+      <w:r>
         <w:t xml:space="preserve">Makrojazyk Maclan umožňuje pomocí parametru </w:t>
       </w:r>
       <w:r>
@@ -7745,7 +7927,11 @@
         <w:t>Project</w:t>
       </w:r>
       <w:r>
-        <w:t>.  Je to z toho důvodu, že základní makro oblasti mohou obsahovat celé aplikace nebo chcete-li softwarové projekty, jejichž instance mohou být dokonce mnohonásobně zopakovány v dané základní oblasti jako „klony“</w:t>
+        <w:t xml:space="preserve">.  Je to z toho důvodu, že základní makro oblasti mohou obsahovat celé aplikace nebo chcete-li softwarové projekty, jejichž </w:t>
+      </w:r>
+      <w:r>
+        <w:lastRenderedPageBreak/>
+        <w:t>instance mohou být dokonce mnohonásobně zopakovány v dané základní oblasti jako „klony“</w:t>
       </w:r>
       <w:r>
         <w:t xml:space="preserve"> nebo kopie</w:t>
@@ -7758,6 +7944,95 @@
       </w:r>
       <w:r>
         <w:t>softwarové aplikace.</w:t>
+      </w:r>
+    </w:p>
+    <w:p>
+      <w:pPr>
+        <w:rPr>
+          <w:lang w:val="en-US"/>
+        </w:rPr>
+      </w:pPr>
+      <w:r>
+        <w:t xml:space="preserve">Sloty oblastí obsahují atribut </w:t>
+      </w:r>
+      <w:r>
+        <w:rPr>
+          <w:i/>
+          <w:iCs/>
+        </w:rPr>
+        <w:t>access</w:t>
+      </w:r>
+      <w:r>
+        <w:t xml:space="preserve">, </w:t>
+      </w:r>
+      <w:r>
+        <w:t>který</w:t>
+      </w:r>
+      <w:r>
+        <w:t xml:space="preserve"> </w:t>
+      </w:r>
+      <w:r>
+        <w:t xml:space="preserve">určuje zda jsou děditelné </w:t>
+      </w:r>
+      <w:r>
+        <w:t xml:space="preserve">v oblastech. </w:t>
+      </w:r>
+      <w:r>
+        <w:t>Tento a</w:t>
+      </w:r>
+      <w:r>
+        <w:t>tribut může nabývat hodnot</w:t>
+      </w:r>
+      <w:r>
+        <w:t xml:space="preserve"> </w:t>
+      </w:r>
+      <w:r>
+        <w:rPr>
+          <w:i/>
+          <w:iCs/>
+        </w:rPr>
+        <w:t>true</w:t>
+      </w:r>
+      <w:r>
+        <w:t xml:space="preserve"> a </w:t>
+      </w:r>
+      <w:r>
+        <w:rPr>
+          <w:i/>
+          <w:iCs/>
+        </w:rPr>
+        <w:t>false</w:t>
+      </w:r>
+      <w:r>
+        <w:t xml:space="preserve">. </w:t>
+      </w:r>
+      <w:r>
+        <w:t xml:space="preserve">Má-li hodnotu </w:t>
+      </w:r>
+      <w:r>
+        <w:rPr>
+          <w:i/>
+          <w:iCs/>
+        </w:rPr>
+        <w:t>false</w:t>
+      </w:r>
+      <w:r>
+        <w:t>, pak se pro daný slot dědičnost nikdy nepoužije.</w:t>
+      </w:r>
+      <w:r>
+        <w:t xml:space="preserve"> Příkladem může být slot obsahující identifikátor tlačítka GUI, jenž není vhodné dědit v jiných ovládacích prvcích kvůli jeho</w:t>
+      </w:r>
+      <w:r>
+        <w:t xml:space="preserve"> požadované</w:t>
+      </w:r>
+      <w:r>
+        <w:t xml:space="preserve"> jednoznačnosti</w:t>
+      </w:r>
+      <w:r>
+        <w:t xml:space="preserve"> v celé aplikaci</w:t>
+      </w:r>
+      <w:r>
+        <w:t>.</w:t>
       </w:r>
     </w:p>
     <w:p>

</xml_diff>